<commit_message>
fix 3.3 Thêm cột NOI_CAP vào bảng QUAN_LY_HD, quản lý nơi cấp cccd
</commit_message>
<xml_diff>
--- a/static/uploads/mau/hopdong/nt1/o1_o2/hdvth.docx
+++ b/static/uploads/mau/hopdong/nt1/o1_o2/hdvth.docx
@@ -154,8 +154,18 @@
                 <w:b/>
                 <w:szCs w:val="24"/>
               </w:rPr>
-              <w:t xml:space="preserve"> phúc</w:t>
-            </w:r>
+              <w:t xml:space="preserve"> </w:t>
+            </w:r>
+            <w:proofErr w:type="spellStart"/>
+            <w:r>
+              <w:rPr>
+                <w:rFonts w:ascii="Times New Roman" w:hAnsi="Times New Roman"/>
+                <w:b/>
+                <w:szCs w:val="24"/>
+              </w:rPr>
+              <w:t>phúc</w:t>
+            </w:r>
+            <w:proofErr w:type="spellEnd"/>
           </w:p>
         </w:tc>
       </w:tr>
@@ -2958,16 +2968,7 @@
                 <w:szCs w:val="24"/>
                 <w:lang w:val="nl-NL"/>
               </w:rPr>
-              <w:t xml:space="preserve">{{cccd}} </w:t>
-            </w:r>
-            <w:r>
-              <w:rPr>
-                <w:rFonts w:ascii="Times New Roman" w:hAnsi="Times New Roman"/>
-                <w:color w:val="000000"/>
-                <w:szCs w:val="24"/>
-                <w:lang w:val="nl-NL"/>
-              </w:rPr>
-              <w:t xml:space="preserve"> Ngày cấp: </w:t>
+              <w:t>{{cccd}}</w:t>
             </w:r>
             <w:r>
               <w:rPr>
@@ -2977,16 +2978,16 @@
                 <w:szCs w:val="24"/>
                 <w:lang w:val="nl-NL"/>
               </w:rPr>
-              <w:t xml:space="preserve">{{ngaycapcc}} </w:t>
-            </w:r>
-            <w:r>
-              <w:rPr>
-                <w:rFonts w:ascii="Times New Roman" w:hAnsi="Times New Roman"/>
-                <w:color w:val="000000"/>
-                <w:szCs w:val="24"/>
-                <w:lang w:val="nl-NL"/>
-              </w:rPr>
-              <w:t xml:space="preserve">Nơi cấp: </w:t>
+              <w:t xml:space="preserve"> </w:t>
+            </w:r>
+            <w:r>
+              <w:rPr>
+                <w:rFonts w:ascii="Times New Roman" w:hAnsi="Times New Roman"/>
+                <w:color w:val="000000"/>
+                <w:szCs w:val="24"/>
+                <w:lang w:val="nl-NL"/>
+              </w:rPr>
+              <w:t xml:space="preserve">Ngày cấp: </w:t>
             </w:r>
             <w:r>
               <w:rPr>
@@ -2996,7 +2997,7 @@
                 <w:szCs w:val="24"/>
                 <w:lang w:val="nl-NL"/>
               </w:rPr>
-              <w:fldChar w:fldCharType="begin"/>
+              <w:t>{{ngaycapcc}}</w:t>
             </w:r>
             <w:r>
               <w:rPr>
@@ -3006,7 +3007,25 @@
                 <w:szCs w:val="24"/>
                 <w:lang w:val="nl-NL"/>
               </w:rPr>
-              <w:instrText xml:space="preserve"> MERGEFIELD "Nơi_cấp" </w:instrText>
+              <w:t xml:space="preserve"> </w:t>
+            </w:r>
+            <w:r>
+              <w:rPr>
+                <w:rFonts w:ascii="Times New Roman" w:hAnsi="Times New Roman"/>
+                <w:color w:val="000000"/>
+                <w:szCs w:val="24"/>
+                <w:lang w:val="nl-NL"/>
+              </w:rPr>
+              <w:t>Nơi cấp:</w:t>
+            </w:r>
+            <w:r>
+              <w:rPr>
+                <w:rFonts w:ascii="Times New Roman" w:hAnsi="Times New Roman"/>
+                <w:color w:val="000000"/>
+                <w:szCs w:val="24"/>
+                <w:lang w:val="nl-NL"/>
+              </w:rPr>
+              <w:t xml:space="preserve"> </w:t>
             </w:r>
             <w:r>
               <w:rPr>
@@ -3016,7 +3035,7 @@
                 <w:szCs w:val="24"/>
                 <w:lang w:val="nl-NL"/>
               </w:rPr>
-              <w:fldChar w:fldCharType="separate"/>
+              <w:t>{{noicap</w:t>
             </w:r>
             <w:r>
               <w:rPr>
@@ -3026,7 +3045,7 @@
                 <w:szCs w:val="24"/>
                 <w:lang w:val="nl-NL"/>
               </w:rPr>
-              <w:t>Cục trưởng cục cảnh sát</w:t>
+              <w:t>cc</w:t>
             </w:r>
             <w:r>
               <w:rPr>
@@ -3036,7 +3055,7 @@
                 <w:szCs w:val="24"/>
                 <w:lang w:val="nl-NL"/>
               </w:rPr>
-              <w:fldChar w:fldCharType="end"/>
+              <w:t>}}</w:t>
             </w:r>
           </w:p>
         </w:tc>
@@ -3613,13 +3632,33 @@
                 <w:szCs w:val="24"/>
                 <w:lang w:val="fr-FR"/>
               </w:rPr>
-              <w:t>{{ngaylamhopdong}}</w:t>
-            </w:r>
+              <w:t>{{</w:t>
+            </w:r>
+            <w:proofErr w:type="spellStart"/>
             <w:r>
               <w:rPr>
                 <w:rFonts w:ascii="Times New Roman" w:hAnsi="Times New Roman"/>
                 <w:i/>
                 <w:szCs w:val="24"/>
+                <w:lang w:val="fr-FR"/>
+              </w:rPr>
+              <w:t>ngaylamhopdong</w:t>
+            </w:r>
+            <w:proofErr w:type="spellEnd"/>
+            <w:r>
+              <w:rPr>
+                <w:rFonts w:ascii="Times New Roman" w:hAnsi="Times New Roman"/>
+                <w:i/>
+                <w:szCs w:val="24"/>
+                <w:lang w:val="fr-FR"/>
+              </w:rPr>
+              <w:t>}}</w:t>
+            </w:r>
+            <w:r>
+              <w:rPr>
+                <w:rFonts w:ascii="Times New Roman" w:hAnsi="Times New Roman"/>
+                <w:i/>
+                <w:szCs w:val="24"/>
                 <w:lang w:val="vi-VN"/>
               </w:rPr>
               <w:t xml:space="preserve"> </w:t>
@@ -3640,13 +3679,33 @@
                 <w:szCs w:val="24"/>
                 <w:lang w:val="fr-FR"/>
               </w:rPr>
-              <w:t>{{thanglamhopdong}}</w:t>
-            </w:r>
+              <w:t>{{</w:t>
+            </w:r>
+            <w:proofErr w:type="spellStart"/>
             <w:r>
               <w:rPr>
                 <w:rFonts w:ascii="Times New Roman" w:hAnsi="Times New Roman"/>
                 <w:i/>
                 <w:szCs w:val="24"/>
+                <w:lang w:val="fr-FR"/>
+              </w:rPr>
+              <w:t>thanglamhopdong</w:t>
+            </w:r>
+            <w:proofErr w:type="spellEnd"/>
+            <w:r>
+              <w:rPr>
+                <w:rFonts w:ascii="Times New Roman" w:hAnsi="Times New Roman"/>
+                <w:i/>
+                <w:szCs w:val="24"/>
+                <w:lang w:val="fr-FR"/>
+              </w:rPr>
+              <w:t>}}</w:t>
+            </w:r>
+            <w:r>
+              <w:rPr>
+                <w:rFonts w:ascii="Times New Roman" w:hAnsi="Times New Roman"/>
+                <w:i/>
+                <w:szCs w:val="24"/>
                 <w:lang w:val="vi-VN"/>
               </w:rPr>
               <w:t xml:space="preserve"> năm </w:t>
@@ -3658,7 +3717,27 @@
                 <w:szCs w:val="24"/>
                 <w:lang w:val="fr-FR"/>
               </w:rPr>
-              <w:t>{{namlamhopdong}}</w:t>
+              <w:t>{{</w:t>
+            </w:r>
+            <w:proofErr w:type="spellStart"/>
+            <w:r>
+              <w:rPr>
+                <w:rFonts w:ascii="Times New Roman" w:hAnsi="Times New Roman"/>
+                <w:i/>
+                <w:szCs w:val="24"/>
+                <w:lang w:val="fr-FR"/>
+              </w:rPr>
+              <w:t>namlamhopdong</w:t>
+            </w:r>
+            <w:proofErr w:type="spellEnd"/>
+            <w:r>
+              <w:rPr>
+                <w:rFonts w:ascii="Times New Roman" w:hAnsi="Times New Roman"/>
+                <w:i/>
+                <w:szCs w:val="24"/>
+                <w:lang w:val="fr-FR"/>
+              </w:rPr>
+              <w:t>}}</w:t>
             </w:r>
           </w:p>
         </w:tc>
@@ -11278,6 +11357,12 @@
   <wne:recipientData>
     <wne:active wne:val="1"/>
     <wne:hash wne:val="1707048493"/>
+  </wne:recipientData>
+  <wne:recipientData>
+    <wne:active wne:val="1"/>
+  </wne:recipientData>
+  <wne:recipientData>
+    <wne:active wne:val="1"/>
   </wne:recipientData>
   <wne:recipientData>
     <wne:active wne:val="1"/>

</xml_diff>